<commit_message>
Përmirëso prezantimin sipas vërejtjeve të mentores
</commit_message>
<xml_diff>
--- a/docs/konferenca/Punimi_nga_e_para.docx
+++ b/docs/konferenca/Punimi_nga_e_para.docx
@@ -8762,7 +8762,7 @@
     </w:p>
     <w:p>
       <w:r>
-        <w:t>Te sllajdi 9 i prezantimit është një ndryshim i vërtetë nga projekti Apache Geode, metoda checkForLimitedOrNoAccess. E gjithë metoda ishte brenda një if-i të madh. Pas Guard Clauses, kushti bëhet një dalje e hershme me return, dhe pjesa tjetër ngjitet një nivel lart. Ndryshimi kompilohet, dhe në rishikim ishte i pranueshëm ashtu siç është.</w:t>
+        <w:t>Te sllajdi 11 i prezantimit është një ndryshim i vërtetë nga projekti Apache Geode, metoda checkForLimitedOrNoAccess. E gjithë metoda ishte brenda një if-i të madh. Pas Guard Clauses, kushti bëhet një dalje e hershme me return, dhe pjesa tjetër ngjitet një nivel lart. Ndryshimi kompilohet, dhe në rishikim ishte i pranueshëm ashtu siç është.</w:t>
       </w:r>
     </w:p>
     <w:p>
@@ -10463,7 +10463,7 @@
       <w:tr>
         <w:tc>
           <w:tcPr>
-            <w:tcW w:type="dxa" w:w="6621"/>
+            <w:tcW w:type="dxa" w:w="6623"/>
           </w:tcPr>
           <w:p>
             <w:r>
@@ -10473,7 +10473,7 @@
         </w:tc>
         <w:tc>
           <w:tcPr>
-            <w:tcW w:type="dxa" w:w="2676"/>
+            <w:tcW w:type="dxa" w:w="2675"/>
           </w:tcPr>
           <w:p>
             <w:r>
@@ -10485,7 +10485,7 @@
       <w:tr>
         <w:tc>
           <w:tcPr>
-            <w:tcW w:type="dxa" w:w="6621"/>
+            <w:tcW w:type="dxa" w:w="6623"/>
           </w:tcPr>
           <w:p>
             <w:r>
@@ -10495,7 +10495,7 @@
         </w:tc>
         <w:tc>
           <w:tcPr>
-            <w:tcW w:type="dxa" w:w="2676"/>
+            <w:tcW w:type="dxa" w:w="2675"/>
           </w:tcPr>
           <w:p>
             <w:r>
@@ -10507,7 +10507,7 @@
       <w:tr>
         <w:tc>
           <w:tcPr>
-            <w:tcW w:type="dxa" w:w="6621"/>
+            <w:tcW w:type="dxa" w:w="6623"/>
           </w:tcPr>
           <w:p>
             <w:r>
@@ -10517,7 +10517,7 @@
         </w:tc>
         <w:tc>
           <w:tcPr>
-            <w:tcW w:type="dxa" w:w="2676"/>
+            <w:tcW w:type="dxa" w:w="2675"/>
           </w:tcPr>
           <w:p>
             <w:r>
@@ -10529,21 +10529,21 @@
       <w:tr>
         <w:tc>
           <w:tcPr>
-            <w:tcW w:type="dxa" w:w="6621"/>
-          </w:tcPr>
-          <w:p>
-            <w:r>
-              <w:t>3 · Katër erërat</w:t>
-            </w:r>
-          </w:p>
-        </w:tc>
-        <w:tc>
-          <w:tcPr>
-            <w:tcW w:type="dxa" w:w="2676"/>
-          </w:tcPr>
-          <w:p>
-            <w:r>
-              <w:t>2</w:t>
+            <w:tcW w:type="dxa" w:w="6623"/>
+          </w:tcPr>
+          <w:p>
+            <w:r>
+              <w:t>3 · Çka shton punimi</w:t>
+            </w:r>
+          </w:p>
+        </w:tc>
+        <w:tc>
+          <w:tcPr>
+            <w:tcW w:type="dxa" w:w="2675"/>
+          </w:tcPr>
+          <w:p>
+            <w:r>
+              <w:t>2, 15, 16</w:t>
             </w:r>
           </w:p>
         </w:tc>
@@ -10551,21 +10551,21 @@
       <w:tr>
         <w:tc>
           <w:tcPr>
-            <w:tcW w:type="dxa" w:w="6621"/>
-          </w:tcPr>
-          <w:p>
-            <w:r>
-              <w:t>4 · JavaSmell</w:t>
-            </w:r>
-          </w:p>
-        </w:tc>
-        <w:tc>
-          <w:tcPr>
-            <w:tcW w:type="dxa" w:w="2676"/>
-          </w:tcPr>
-          <w:p>
-            <w:r>
-              <w:t>4, 5, 6, 7, 12, 14</w:t>
+            <w:tcW w:type="dxa" w:w="6623"/>
+          </w:tcPr>
+          <w:p>
+            <w:r>
+              <w:t>4 · Katër erërat</w:t>
+            </w:r>
+          </w:p>
+        </w:tc>
+        <w:tc>
+          <w:tcPr>
+            <w:tcW w:type="dxa" w:w="2675"/>
+          </w:tcPr>
+          <w:p>
+            <w:r>
+              <w:t>2</w:t>
             </w:r>
           </w:p>
         </w:tc>
@@ -10573,21 +10573,21 @@
       <w:tr>
         <w:tc>
           <w:tcPr>
-            <w:tcW w:type="dxa" w:w="6621"/>
-          </w:tcPr>
-          <w:p>
-            <w:r>
-              <w:t>5 · Të dhënat dhe prova e drejtë</w:t>
-            </w:r>
-          </w:p>
-        </w:tc>
-        <w:tc>
-          <w:tcPr>
-            <w:tcW w:type="dxa" w:w="2676"/>
-          </w:tcPr>
-          <w:p>
-            <w:r>
-              <w:t>8, 9</w:t>
+            <w:tcW w:type="dxa" w:w="6623"/>
+          </w:tcPr>
+          <w:p>
+            <w:r>
+              <w:t>5 · JavaSmell</w:t>
+            </w:r>
+          </w:p>
+        </w:tc>
+        <w:tc>
+          <w:tcPr>
+            <w:tcW w:type="dxa" w:w="2675"/>
+          </w:tcPr>
+          <w:p>
+            <w:r>
+              <w:t>4, 5, 6, 7, 12, 14</w:t>
             </w:r>
           </w:p>
         </w:tc>
@@ -10595,21 +10595,21 @@
       <w:tr>
         <w:tc>
           <w:tcPr>
-            <w:tcW w:type="dxa" w:w="6621"/>
-          </w:tcPr>
-          <w:p>
-            <w:r>
-              <w:t>6 · Rregullat kundrejt modeleve</w:t>
-            </w:r>
-          </w:p>
-        </w:tc>
-        <w:tc>
-          <w:tcPr>
-            <w:tcW w:type="dxa" w:w="2676"/>
-          </w:tcPr>
-          <w:p>
-            <w:r>
-              <w:t>6, 7, 9, 10</w:t>
+            <w:tcW w:type="dxa" w:w="6623"/>
+          </w:tcPr>
+          <w:p>
+            <w:r>
+              <w:t>6 · Të dhënat dhe prova e drejtë</w:t>
+            </w:r>
+          </w:p>
+        </w:tc>
+        <w:tc>
+          <w:tcPr>
+            <w:tcW w:type="dxa" w:w="2675"/>
+          </w:tcPr>
+          <w:p>
+            <w:r>
+              <w:t>8, 9</w:t>
             </w:r>
           </w:p>
         </w:tc>
@@ -10617,21 +10617,21 @@
       <w:tr>
         <w:tc>
           <w:tcPr>
-            <w:tcW w:type="dxa" w:w="6621"/>
-          </w:tcPr>
-          <w:p>
-            <w:r>
-              <w:t>7 · Pajtimi i njerëzve</w:t>
-            </w:r>
-          </w:p>
-        </w:tc>
-        <w:tc>
-          <w:tcPr>
-            <w:tcW w:type="dxa" w:w="2676"/>
-          </w:tcPr>
-          <w:p>
-            <w:r>
-              <w:t>11</w:t>
+            <w:tcW w:type="dxa" w:w="6623"/>
+          </w:tcPr>
+          <w:p>
+            <w:r>
+              <w:t>7 · Rregullat kundrejt modeleve</w:t>
+            </w:r>
+          </w:p>
+        </w:tc>
+        <w:tc>
+          <w:tcPr>
+            <w:tcW w:type="dxa" w:w="2675"/>
+          </w:tcPr>
+          <w:p>
+            <w:r>
+              <w:t>6, 7, 9, 10</w:t>
             </w:r>
           </w:p>
         </w:tc>
@@ -10639,21 +10639,21 @@
       <w:tr>
         <w:tc>
           <w:tcPr>
-            <w:tcW w:type="dxa" w:w="6621"/>
-          </w:tcPr>
-          <w:p>
-            <w:r>
-              <w:t>8 · Motori i refaktorimit</w:t>
-            </w:r>
-          </w:p>
-        </w:tc>
-        <w:tc>
-          <w:tcPr>
-            <w:tcW w:type="dxa" w:w="2676"/>
-          </w:tcPr>
-          <w:p>
-            <w:r>
-              <w:t>12, 13</w:t>
+            <w:tcW w:type="dxa" w:w="6623"/>
+          </w:tcPr>
+          <w:p>
+            <w:r>
+              <w:t>8 · Pajtimi i njerëzve</w:t>
+            </w:r>
+          </w:p>
+        </w:tc>
+        <w:tc>
+          <w:tcPr>
+            <w:tcW w:type="dxa" w:w="2675"/>
+          </w:tcPr>
+          <w:p>
+            <w:r>
+              <w:t>11</w:t>
             </w:r>
           </w:p>
         </w:tc>
@@ -10661,17 +10661,17 @@
       <w:tr>
         <w:tc>
           <w:tcPr>
-            <w:tcW w:type="dxa" w:w="6621"/>
-          </w:tcPr>
-          <w:p>
-            <w:r>
-              <w:t>9 · Shembulli nga Apache Geode</w:t>
-            </w:r>
-          </w:p>
-        </w:tc>
-        <w:tc>
-          <w:tcPr>
-            <w:tcW w:type="dxa" w:w="2676"/>
+            <w:tcW w:type="dxa" w:w="6623"/>
+          </w:tcPr>
+          <w:p>
+            <w:r>
+              <w:t>9 · Motori i refaktorimit</w:t>
+            </w:r>
+          </w:p>
+        </w:tc>
+        <w:tc>
+          <w:tcPr>
+            <w:tcW w:type="dxa" w:w="2675"/>
           </w:tcPr>
           <w:p>
             <w:r>
@@ -10683,21 +10683,87 @@
       <w:tr>
         <w:tc>
           <w:tcPr>
-            <w:tcW w:type="dxa" w:w="6621"/>
-          </w:tcPr>
-          <w:p>
-            <w:r>
-              <w:t>10 · Përgjigjet dhe kufijtë</w:t>
-            </w:r>
-          </w:p>
-        </w:tc>
-        <w:tc>
-          <w:tcPr>
-            <w:tcW w:type="dxa" w:w="2676"/>
+            <w:tcW w:type="dxa" w:w="6623"/>
+          </w:tcPr>
+          <w:p>
+            <w:r>
+              <w:t>10 · Si u verifikuan rishkrimet</w:t>
+            </w:r>
+          </w:p>
+        </w:tc>
+        <w:tc>
+          <w:tcPr>
+            <w:tcW w:type="dxa" w:w="2675"/>
+          </w:tcPr>
+          <w:p>
+            <w:r>
+              <w:t>12, 13, 17</w:t>
+            </w:r>
+          </w:p>
+        </w:tc>
+      </w:tr>
+      <w:tr>
+        <w:tc>
+          <w:tcPr>
+            <w:tcW w:type="dxa" w:w="6623"/>
+          </w:tcPr>
+          <w:p>
+            <w:r>
+              <w:t>11 · Shembulli nga Apache Geode</w:t>
+            </w:r>
+          </w:p>
+        </w:tc>
+        <w:tc>
+          <w:tcPr>
+            <w:tcW w:type="dxa" w:w="2675"/>
+          </w:tcPr>
+          <w:p>
+            <w:r>
+              <w:t>12, 13</w:t>
+            </w:r>
+          </w:p>
+        </w:tc>
+      </w:tr>
+      <w:tr>
+        <w:tc>
+          <w:tcPr>
+            <w:tcW w:type="dxa" w:w="6623"/>
+          </w:tcPr>
+          <w:p>
+            <w:r>
+              <w:t>12 · Gjetjet dhe çka vjen më pas</w:t>
+            </w:r>
+          </w:p>
+        </w:tc>
+        <w:tc>
+          <w:tcPr>
+            <w:tcW w:type="dxa" w:w="2675"/>
           </w:tcPr>
           <w:p>
             <w:r>
               <w:t>10, 13, 17</w:t>
+            </w:r>
+          </w:p>
+        </w:tc>
+      </w:tr>
+      <w:tr>
+        <w:tc>
+          <w:tcPr>
+            <w:tcW w:type="dxa" w:w="6623"/>
+          </w:tcPr>
+          <w:p>
+            <w:r>
+              <w:t>13 · Referencat</w:t>
+            </w:r>
+          </w:p>
+        </w:tc>
+        <w:tc>
+          <w:tcPr>
+            <w:tcW w:type="dxa" w:w="2675"/>
+          </w:tcPr>
+          <w:p>
+            <w:r>
+              <w:t>21</w:t>
             </w:r>
           </w:p>
         </w:tc>

</xml_diff>